<commit_message>
feat: add serverless / function compute support
- Add handler.py with Mangum adapter for FC/SCF/Lambda
- Add serverless/fc_handler.py and serverless/scf_handler.py
- Add s.yaml (Aliyun Serverless Devs), serverless/template.yaml (Tencent SCF)
- Add .fcignore
- Update requirements.txt with mangum
- Update README with function compute deployment info
- Update docs/手机部署教程.md with FC/SCF mobile instructions
- Regenerate docs/部署方法.docx with FC/SCF chapters
</commit_message>
<xml_diff>
--- a/docs/部署方法.docx
+++ b/docs/部署方法.docx
@@ -896,7 +896,265 @@
           <w:b/>
           <w:sz w:val="36"/>
         </w:rPr>
-        <w:t>八、注册到腾讯元器插件中心</w:t>
+        <w:t>八、方法 6：阿里云函数计算 FC（函数计算，国内访问快）</w:t>
+      </w:r>
+    </w:p>
+    <w:p>
+      <w:pPr>
+        <w:spacing w:line="360" w:lineRule="auto"/>
+      </w:pPr>
+      <w:r>
+        <w:rPr>
+          <w:rFonts w:ascii="Microsoft YaHei" w:hAnsi="Microsoft YaHei" w:eastAsia="Microsoft YaHei"/>
+          <w:b w:val="0"/>
+          <w:sz w:val="20"/>
+        </w:rPr>
+        <w:t>优点：按调用计费、不用维护服务器、国内访问快。缺点：实例无状态，本地文件/数据在实例回收后丢失。</w:t>
+      </w:r>
+    </w:p>
+    <w:p>
+      <w:pPr>
+        <w:spacing w:line="360" w:lineRule="auto"/>
+      </w:pPr>
+      <w:r>
+        <w:rPr>
+          <w:rFonts w:ascii="Microsoft YaHei" w:hAnsi="Microsoft YaHei" w:eastAsia="Microsoft YaHei"/>
+          <w:b w:val="0"/>
+          <w:sz w:val="21"/>
+        </w:rPr>
+        <w:t>访问 https://fc.console.aliyun.com/ 并开通函数计算服务。</w:t>
+      </w:r>
+    </w:p>
+    <w:p>
+      <w:pPr>
+        <w:spacing w:line="360" w:lineRule="auto"/>
+      </w:pPr>
+      <w:r>
+        <w:rPr>
+          <w:rFonts w:ascii="Microsoft YaHei" w:hAnsi="Microsoft YaHei" w:eastAsia="Microsoft YaHei"/>
+          <w:b w:val="0"/>
+          <w:sz w:val="21"/>
+        </w:rPr>
+        <w:t>点击「函数」→「创建函数」，选择「自定义创建」：</w:t>
+      </w:r>
+    </w:p>
+    <w:p>
+      <w:pPr>
+        <w:spacing w:line="240" w:lineRule="auto"/>
+        <w:ind w:left="432"/>
+      </w:pPr>
+      <w:r>
+        <w:rPr>
+          <w:rFonts w:ascii="Consolas" w:hAnsi="Consolas" w:eastAsia="Consolas"/>
+          <w:b w:val="0"/>
+          <w:color w:val="2C3E50"/>
+          <w:sz w:val="18"/>
+        </w:rPr>
+        <w:t>函数类型：HTTP 函数</w:t>
+        <w:br/>
+        <w:t>函数名称：yuanqi-plugins</w:t>
+        <w:br/>
+        <w:t>运行环境：Python 3.11</w:t>
+        <w:br/>
+        <w:t>请求处理程序（Handler）：handler</w:t>
+        <w:br/>
+        <w:t>内存规格：1024 MB</w:t>
+        <w:br/>
+        <w:t>超时时间：60 秒</w:t>
+        <w:br/>
+      </w:r>
+    </w:p>
+    <w:p>
+      <w:pPr>
+        <w:spacing w:line="360" w:lineRule="auto"/>
+      </w:pPr>
+      <w:r>
+        <w:rPr>
+          <w:rFonts w:ascii="Microsoft YaHei" w:hAnsi="Microsoft YaHei" w:eastAsia="Microsoft YaHei"/>
+          <w:b w:val="0"/>
+          <w:sz w:val="21"/>
+        </w:rPr>
+        <w:t>上传代码：可下载 GitHub 仓库 ZIP 包，在「代码」标签页上传；或使用 Serverless Devs 命令行 `s deploy`。</w:t>
+      </w:r>
+    </w:p>
+    <w:p>
+      <w:pPr>
+        <w:spacing w:line="360" w:lineRule="auto"/>
+      </w:pPr>
+      <w:r>
+        <w:rPr>
+          <w:rFonts w:ascii="Microsoft YaHei" w:hAnsi="Microsoft YaHei" w:eastAsia="Microsoft YaHei"/>
+          <w:b w:val="0"/>
+          <w:sz w:val="21"/>
+        </w:rPr>
+        <w:t>创建 HTTP 触发器，请求方法勾选 GET/POST/PUT/DELETE/OPTIONS，认证方式选择「无需认证」。</w:t>
+      </w:r>
+    </w:p>
+    <w:p>
+      <w:pPr>
+        <w:spacing w:line="360" w:lineRule="auto"/>
+      </w:pPr>
+      <w:r>
+        <w:rPr>
+          <w:rFonts w:ascii="Microsoft YaHei" w:hAnsi="Microsoft YaHei" w:eastAsia="Microsoft YaHei"/>
+          <w:b w:val="0"/>
+          <w:sz w:val="21"/>
+        </w:rPr>
+        <w:t>部署完成后复制公网地址，例如 `https://yuanqi-plugins-xxx.cn-hangzhou.fcapp.run`。</w:t>
+      </w:r>
+    </w:p>
+    <w:p>
+      <w:pPr>
+        <w:spacing w:line="360" w:lineRule="auto"/>
+      </w:pPr>
+      <w:r>
+        <w:rPr>
+          <w:rFonts w:ascii="Microsoft YaHei" w:hAnsi="Microsoft YaHei" w:eastAsia="Microsoft YaHei"/>
+          <w:b w:val="0"/>
+          <w:sz w:val="21"/>
+        </w:rPr>
+        <w:t>按「二、通用部署后配置」修改 `specs/*.yaml` 并注册。</w:t>
+      </w:r>
+    </w:p>
+    <w:p>
+      <w:pPr>
+        <w:pStyle w:val="Heading1"/>
+      </w:pPr>
+      <w:r>
+        <w:rPr>
+          <w:rFonts w:ascii="Microsoft YaHei" w:hAnsi="Microsoft YaHei" w:eastAsia="Microsoft YaHei"/>
+          <w:b/>
+          <w:sz w:val="36"/>
+        </w:rPr>
+        <w:t>九、方法 7：腾讯云云函数 SCF（函数计算）</w:t>
+      </w:r>
+    </w:p>
+    <w:p>
+      <w:pPr>
+        <w:spacing w:line="360" w:lineRule="auto"/>
+      </w:pPr>
+      <w:r>
+        <w:rPr>
+          <w:rFonts w:ascii="Microsoft YaHei" w:hAnsi="Microsoft YaHei" w:eastAsia="Microsoft YaHei"/>
+          <w:b w:val="0"/>
+          <w:sz w:val="20"/>
+        </w:rPr>
+        <w:t>优点：与腾讯元器同属腾讯云生态，访问延迟低。缺点：需要配置 API 网关触发器。</w:t>
+      </w:r>
+    </w:p>
+    <w:p>
+      <w:pPr>
+        <w:spacing w:line="360" w:lineRule="auto"/>
+      </w:pPr>
+      <w:r>
+        <w:rPr>
+          <w:rFonts w:ascii="Microsoft YaHei" w:hAnsi="Microsoft YaHei" w:eastAsia="Microsoft YaHei"/>
+          <w:b w:val="0"/>
+          <w:sz w:val="21"/>
+        </w:rPr>
+        <w:t>访问 https://console.cloud.tencent.com/scf 并创建函数。</w:t>
+      </w:r>
+    </w:p>
+    <w:p>
+      <w:pPr>
+        <w:spacing w:line="360" w:lineRule="auto"/>
+      </w:pPr>
+      <w:r>
+        <w:rPr>
+          <w:rFonts w:ascii="Microsoft YaHei" w:hAnsi="Microsoft YaHei" w:eastAsia="Microsoft YaHei"/>
+          <w:b w:val="0"/>
+          <w:sz w:val="21"/>
+        </w:rPr>
+        <w:t>选择「从头开始」：</w:t>
+      </w:r>
+    </w:p>
+    <w:p>
+      <w:pPr>
+        <w:spacing w:line="240" w:lineRule="auto"/>
+        <w:ind w:left="432"/>
+      </w:pPr>
+      <w:r>
+        <w:rPr>
+          <w:rFonts w:ascii="Consolas" w:hAnsi="Consolas" w:eastAsia="Consolas"/>
+          <w:b w:val="0"/>
+          <w:color w:val="2C3E50"/>
+          <w:sz w:val="18"/>
+        </w:rPr>
+        <w:t>函数名称：yuanqi-plugins</w:t>
+        <w:br/>
+        <w:t>运行环境：Python 3.11</w:t>
+        <w:br/>
+        <w:t>执行方法：handler.main_handler</w:t>
+        <w:br/>
+        <w:t>内存：1024 MB</w:t>
+        <w:br/>
+        <w:t>超时时间：60 秒</w:t>
+        <w:br/>
+      </w:r>
+    </w:p>
+    <w:p>
+      <w:pPr>
+        <w:spacing w:line="360" w:lineRule="auto"/>
+      </w:pPr>
+      <w:r>
+        <w:rPr>
+          <w:rFonts w:ascii="Microsoft YaHei" w:hAnsi="Microsoft YaHei" w:eastAsia="Microsoft YaHei"/>
+          <w:b w:val="0"/>
+          <w:sz w:val="21"/>
+        </w:rPr>
+        <w:t>上传代码：下载 GitHub 仓库 ZIP 包，在函数「代码」页本地上传。</w:t>
+      </w:r>
+    </w:p>
+    <w:p>
+      <w:pPr>
+        <w:spacing w:line="360" w:lineRule="auto"/>
+      </w:pPr>
+      <w:r>
+        <w:rPr>
+          <w:rFonts w:ascii="Microsoft YaHei" w:hAnsi="Microsoft YaHei" w:eastAsia="Microsoft YaHei"/>
+          <w:b w:val="0"/>
+          <w:sz w:val="21"/>
+        </w:rPr>
+        <w:t>进入「触发管理」→「创建触发器」，选择「API 网关」，服务名填 `yuanqi-plugins-api`，发布环境选择「发布」，请求方法选择「ANY」。</w:t>
+      </w:r>
+    </w:p>
+    <w:p>
+      <w:pPr>
+        <w:spacing w:line="360" w:lineRule="auto"/>
+      </w:pPr>
+      <w:r>
+        <w:rPr>
+          <w:rFonts w:ascii="Microsoft YaHei" w:hAnsi="Microsoft YaHei" w:eastAsia="Microsoft YaHei"/>
+          <w:b w:val="0"/>
+          <w:sz w:val="21"/>
+        </w:rPr>
+        <w:t>创建完成后复制访问路径，例如 `https://service-xxx.gz.apigw.tencentcs.com/release/`。</w:t>
+      </w:r>
+    </w:p>
+    <w:p>
+      <w:pPr>
+        <w:spacing w:line="360" w:lineRule="auto"/>
+      </w:pPr>
+      <w:r>
+        <w:rPr>
+          <w:rFonts w:ascii="Microsoft YaHei" w:hAnsi="Microsoft YaHei" w:eastAsia="Microsoft YaHei"/>
+          <w:b w:val="0"/>
+          <w:sz w:val="21"/>
+        </w:rPr>
+        <w:t>按「二、通用部署后配置」修改 `specs/*.yaml` 并注册。</w:t>
+      </w:r>
+    </w:p>
+    <w:p>
+      <w:pPr>
+        <w:pStyle w:val="Heading1"/>
+      </w:pPr>
+      <w:r>
+        <w:rPr>
+          <w:rFonts w:ascii="Microsoft YaHei" w:hAnsi="Microsoft YaHei" w:eastAsia="Microsoft YaHei"/>
+          <w:b/>
+          <w:sz w:val="36"/>
+        </w:rPr>
+        <w:t>十、注册到腾讯元器插件中心</w:t>
       </w:r>
     </w:p>
     <w:p>
@@ -988,7 +1246,7 @@
           <w:b/>
           <w:sz w:val="36"/>
         </w:rPr>
-        <w:t>九、安全与运维建议</w:t>
+        <w:t>十一、安全与运维建议</w:t>
       </w:r>
     </w:p>
     <w:p>
@@ -1058,6 +1316,32 @@
     </w:p>
     <w:p>
       <w:pPr>
+        <w:spacing w:line="360" w:lineRule="auto"/>
+      </w:pPr>
+      <w:r>
+        <w:rPr>
+          <w:rFonts w:ascii="Microsoft YaHei" w:hAnsi="Microsoft YaHei" w:eastAsia="Microsoft YaHei"/>
+          <w:b w:val="0"/>
+          <w:sz w:val="21"/>
+        </w:rPr>
+        <w:t>6. 函数计算场景下，文件/技能/任务等本地数据会丢失，生产环境请挂载 NAS/CFS 或改用对象存储/数据库。</w:t>
+      </w:r>
+    </w:p>
+    <w:p>
+      <w:pPr>
+        <w:spacing w:line="360" w:lineRule="auto"/>
+      </w:pPr>
+      <w:r>
+        <w:rPr>
+          <w:rFonts w:ascii="Microsoft YaHei" w:hAnsi="Microsoft YaHei" w:eastAsia="Microsoft YaHei"/>
+          <w:b w:val="0"/>
+          <w:sz w:val="21"/>
+        </w:rPr>
+        <w:t>7. 函数计算建议设置超时 60 秒、内存 1024 MB，避免文件转换和网页抓取超时。</w:t>
+      </w:r>
+    </w:p>
+    <w:p>
+      <w:pPr>
         <w:pStyle w:val="Heading1"/>
       </w:pPr>
       <w:r>
@@ -1066,7 +1350,7 @@
           <w:b/>
           <w:sz w:val="36"/>
         </w:rPr>
-        <w:t>十、常见问题</w:t>
+        <w:t>十二、常见问题</w:t>
       </w:r>
     </w:p>
     <w:p>
@@ -1171,6 +1455,58 @@
           <w:sz w:val="21"/>
         </w:rPr>
         <w:t>A：确认服务器已安装 JDK。Docker 镜像已内置 default-jdk。</w:t>
+      </w:r>
+    </w:p>
+    <w:p>
+      <w:pPr>
+        <w:spacing w:line="360" w:lineRule="auto"/>
+      </w:pPr>
+      <w:r>
+        <w:rPr>
+          <w:rFonts w:ascii="Microsoft YaHei" w:hAnsi="Microsoft YaHei" w:eastAsia="Microsoft YaHei"/>
+          <w:b/>
+          <w:sz w:val="21"/>
+        </w:rPr>
+        <w:t>Q：函数计算部署后文件/任务数据丢失？</w:t>
+      </w:r>
+    </w:p>
+    <w:p>
+      <w:pPr>
+        <w:spacing w:line="360" w:lineRule="auto"/>
+      </w:pPr>
+      <w:r>
+        <w:rPr>
+          <w:rFonts w:ascii="Microsoft YaHei" w:hAnsi="Microsoft YaHei" w:eastAsia="Microsoft YaHei"/>
+          <w:b w:val="0"/>
+          <w:sz w:val="21"/>
+        </w:rPr>
+        <w:t>A：函数计算实例无状态，本地数据会随实例回收清空。测试场景不影响，生产场景请挂载 NAS/CFS 或改用数据库存储。</w:t>
+      </w:r>
+    </w:p>
+    <w:p>
+      <w:pPr>
+        <w:spacing w:line="360" w:lineRule="auto"/>
+      </w:pPr>
+      <w:r>
+        <w:rPr>
+          <w:rFonts w:ascii="Microsoft YaHei" w:hAnsi="Microsoft YaHei" w:eastAsia="Microsoft YaHei"/>
+          <w:b/>
+          <w:sz w:val="21"/>
+        </w:rPr>
+        <w:t>Q：函数计算返回 502 错误？</w:t>
+      </w:r>
+    </w:p>
+    <w:p>
+      <w:pPr>
+        <w:spacing w:line="360" w:lineRule="auto"/>
+      </w:pPr>
+      <w:r>
+        <w:rPr>
+          <w:rFonts w:ascii="Microsoft YaHei" w:hAnsi="Microsoft YaHei" w:eastAsia="Microsoft YaHei"/>
+          <w:b w:val="0"/>
+          <w:sz w:val="21"/>
+        </w:rPr>
+        <w:t>A：通常因超时或内存不足导致。请将超时时间设为 60 秒，内存设为 1024 MB。</w:t>
       </w:r>
     </w:p>
     <w:sectPr>

</xml_diff>

<commit_message>
fix: update SCF deployment for Python 3.10 and Web Function
- Add SCF Web Function support via serverless/scf_handler.app
- Keep SCF Event Function + API Gateway support via main_handler
- Update runtime from Python 3.11 to Python 3.10 in docs and configs
- Update 手机部署教程.md and README.md with Web Function instructions
- Regenerate 部署方法.docx
</commit_message>
<xml_diff>
--- a/docs/部署方法.docx
+++ b/docs/部署方法.docx
@@ -954,7 +954,7 @@
         <w:br/>
         <w:t>函数名称：yuanqi-plugins</w:t>
         <w:br/>
-        <w:t>运行环境：Python 3.11</w:t>
+        <w:t>运行环境：Python 3.10</w:t>
         <w:br/>
         <w:t>请求处理程序（Handler）：handler</w:t>
         <w:br/>
@@ -1039,7 +1039,7 @@
           <w:b w:val="0"/>
           <w:sz w:val="20"/>
         </w:rPr>
-        <w:t>优点：与腾讯元器同属腾讯云生态，访问延迟低。缺点：需要配置 API 网关触发器。</w:t>
+        <w:t>优点：与腾讯元器同属腾讯云生态，访问延迟低。缺点：函数计算实例无状态，本地数据会丢失。</w:t>
       </w:r>
     </w:p>
     <w:p>
@@ -1052,7 +1052,7 @@
           <w:b w:val="0"/>
           <w:sz w:val="21"/>
         </w:rPr>
-        <w:t>访问 https://console.cloud.tencent.com/scf 并创建函数。</w:t>
+        <w:t>推荐选择 Web 函数，无需单独配置 API 网关；如果没有 Web 函数选项，则选择事件函数 + API 网关触发器。</w:t>
       </w:r>
     </w:p>
     <w:p>
@@ -1065,7 +1065,7 @@
           <w:b w:val="0"/>
           <w:sz w:val="21"/>
         </w:rPr>
-        <w:t>选择「从头开始」：</w:t>
+        <w:t>方式 A：Web 函数（推荐）</w:t>
       </w:r>
     </w:p>
     <w:p>
@@ -1082,9 +1082,11 @@
         </w:rPr>
         <w:t>函数名称：yuanqi-plugins</w:t>
         <w:br/>
-        <w:t>运行环境：Python 3.11</w:t>
+        <w:t>函数类型：Web 函数</w:t>
         <w:br/>
-        <w:t>执行方法：handler.main_handler</w:t>
+        <w:t>运行环境：Python 3.10</w:t>
+        <w:br/>
+        <w:t>执行方法：serverless.scf_handler.app</w:t>
         <w:br/>
         <w:t>内存：1024 MB</w:t>
         <w:br/>
@@ -1115,7 +1117,63 @@
           <w:b w:val="0"/>
           <w:sz w:val="21"/>
         </w:rPr>
-        <w:t>进入「触发管理」→「创建触发器」，选择「API 网关」，服务名填 `yuanqi-plugins-api`，发布环境选择「发布」，请求方法选择「ANY」。</w:t>
+        <w:t>创建完成后 SCF 会自动分配访问地址，例如 `https://yuanqi-plugins-xxx.gz.apigw.tencentcs.com/`。</w:t>
+      </w:r>
+    </w:p>
+    <w:p>
+      <w:pPr>
+        <w:spacing w:line="360" w:lineRule="auto"/>
+      </w:pPr>
+      <w:r>
+        <w:rPr>
+          <w:rFonts w:ascii="Microsoft YaHei" w:hAnsi="Microsoft YaHei" w:eastAsia="Microsoft YaHei"/>
+          <w:b w:val="0"/>
+          <w:sz w:val="21"/>
+        </w:rPr>
+        <w:t>方式 B：事件函数 + API 网关</w:t>
+      </w:r>
+    </w:p>
+    <w:p>
+      <w:pPr>
+        <w:spacing w:line="240" w:lineRule="auto"/>
+        <w:ind w:left="432"/>
+      </w:pPr>
+      <w:r>
+        <w:rPr>
+          <w:rFonts w:ascii="Consolas" w:hAnsi="Consolas" w:eastAsia="Consolas"/>
+          <w:b w:val="0"/>
+          <w:color w:val="2C3E50"/>
+          <w:sz w:val="18"/>
+        </w:rPr>
+        <w:t>函数名称：yuanqi-plugins</w:t>
+        <w:br/>
+        <w:t>函数类型：事件函数</w:t>
+        <w:br/>
+        <w:t>运行环境：Python 3.10</w:t>
+        <w:br/>
+        <w:t>执行方法：serverless.scf_handler.main_handler</w:t>
+        <w:br/>
+        <w:t>内存：1024 MB</w:t>
+        <w:br/>
+        <w:t>超时时间：60 秒</w:t>
+        <w:br/>
+        <w:t>触发器：API 网关</w:t>
+        <w:br/>
+        <w:t>请求方法：ANY</w:t>
+        <w:br/>
+      </w:r>
+    </w:p>
+    <w:p>
+      <w:pPr>
+        <w:spacing w:line="360" w:lineRule="auto"/>
+      </w:pPr>
+      <w:r>
+        <w:rPr>
+          <w:rFonts w:ascii="Microsoft YaHei" w:hAnsi="Microsoft YaHei" w:eastAsia="Microsoft YaHei"/>
+          <w:b w:val="0"/>
+          <w:sz w:val="21"/>
+        </w:rPr>
+        <w:t>上传代码后，进入「触发管理」→「创建触发器」，选择「API 网关」，服务名填 `yuanqi-plugins-api`，发布环境选择「发布」，请求方法选择「ANY」。</w:t>
       </w:r>
     </w:p>
     <w:p>

</xml_diff>